<commit_message>
Move `PriceUpdateResult` and `SymbolPriceOutcome` to `pricing_helpers`, update imports, and add unit tests.
</commit_message>
<xml_diff>
--- a/resources/docs/Pricing spec.docx
+++ b/resources/docs/Pricing spec.docx
@@ -248,13 +248,7 @@
         </w:numPr>
       </w:pPr>
       <w:r>
-        <w:t xml:space="preserve">Symbol (from </w:t>
-      </w:r>
-      <w:r>
-        <w:t xml:space="preserve">SC </w:t>
-      </w:r>
-      <w:r>
-        <w:t>Symbol column)</w:t>
+        <w:t>Symbol (from SC Symbol column)</w:t>
       </w:r>
     </w:p>
     <w:p>
@@ -266,13 +260,7 @@
         </w:numPr>
       </w:pPr>
       <w:r>
-        <w:t>Update</w:t>
-      </w:r>
-      <w:r>
-        <w:t>d</w:t>
-      </w:r>
-      <w:r>
-        <w:t xml:space="preserve"> price (or existing price if failure)</w:t>
+        <w:t>Updated price (or existing price if failure)</w:t>
       </w:r>
     </w:p>
     <w:p>
@@ -311,10 +299,7 @@
         </w:numPr>
       </w:pPr>
       <w:r>
-        <w:t xml:space="preserve">Short </w:t>
-      </w:r>
-      <w:r>
-        <w:t>Put</w:t>
+        <w:t>Short Put</w:t>
       </w:r>
     </w:p>
     <w:p>
@@ -326,13 +311,7 @@
         </w:numPr>
       </w:pPr>
       <w:r>
-        <w:t>Symbol (from S</w:t>
-      </w:r>
-      <w:r>
-        <w:t>P</w:t>
-      </w:r>
-      <w:r>
-        <w:t xml:space="preserve"> Symbol column)</w:t>
+        <w:t>Symbol (from SP Symbol column)</w:t>
       </w:r>
     </w:p>
     <w:p>
@@ -389,10 +368,7 @@
         </w:numPr>
       </w:pPr>
       <w:r>
-        <w:t>Long</w:t>
-      </w:r>
-      <w:r>
-        <w:t xml:space="preserve"> Calls</w:t>
+        <w:t>Long Calls</w:t>
       </w:r>
     </w:p>
     <w:p>
@@ -404,13 +380,7 @@
         </w:numPr>
       </w:pPr>
       <w:r>
-        <w:t xml:space="preserve">Symbol (from </w:t>
-      </w:r>
-      <w:r>
-        <w:t>L</w:t>
-      </w:r>
-      <w:r>
-        <w:t>C Symbol column)</w:t>
+        <w:t>Symbol (from LC Symbol column)</w:t>
       </w:r>
     </w:p>
     <w:p>
@@ -491,13 +461,7 @@
         </w:numPr>
       </w:pPr>
       <w:r>
-        <w:t>Symbol (from L</w:t>
-      </w:r>
-      <w:r>
-        <w:t>P</w:t>
-      </w:r>
-      <w:r>
-        <w:t xml:space="preserve"> Symbol column)</w:t>
+        <w:t>Symbol (from LP Symbol column)</w:t>
       </w:r>
     </w:p>
     <w:p>
@@ -527,10 +491,7 @@
         <w:t>"</w:t>
       </w:r>
       <w:r>
-        <w:t>L</w:t>
-      </w:r>
-      <w:r>
-        <w:t>P</w:t>
+        <w:t>LP</w:t>
       </w:r>
       <w:r>
         <w:t xml:space="preserve"> </w:t>
@@ -630,10 +591,7 @@
         </w:numPr>
       </w:pPr>
       <w:r>
-        <w:t>Overwrite existing file with same name</w:t>
-      </w:r>
-      <w:r>
-        <w:t xml:space="preserve"> (assume it is stale if VBA didn’t move it)</w:t>
+        <w:t>Overwrite existing file with same name (assume it is stale if VBA didn’t move it)</w:t>
       </w:r>
     </w:p>
     <w:p>
@@ -815,11 +773,1404 @@
           <w:ilvl w:val="1"/>
           <w:numId w:val="3"/>
         </w:numPr>
+        <w:pBdr>
+          <w:bottom w:val="single" w:sz="6" w:space="1" w:color="auto"/>
+        </w:pBdr>
       </w:pPr>
       <w:r>
         <w:t>The actual batch fetch for all options can likely be done in a single pass to save time, unless that’s too confusing</w:t>
       </w:r>
     </w:p>
+    <w:p>
+      <w:pPr>
+        <w:spacing w:before="100" w:beforeAutospacing="1" w:after="100" w:afterAutospacing="1" w:line="240" w:lineRule="auto"/>
+        <w:rPr>
+          <w:rFonts w:ascii="Times New Roman" w:eastAsia="Times New Roman" w:hAnsi="Times New Roman" w:cs="Times New Roman"/>
+          <w:sz w:val="24"/>
+          <w:szCs w:val="24"/>
+        </w:rPr>
+      </w:pPr>
+      <w:r>
+        <w:rPr>
+          <w:rFonts w:ascii="Times New Roman" w:eastAsia="Times New Roman" w:hAnsi="Times New Roman" w:cs="Times New Roman"/>
+          <w:sz w:val="24"/>
+          <w:szCs w:val="24"/>
+        </w:rPr>
+        <w:t xml:space="preserve">Good — here's a first pass at </w:t>
+      </w:r>
+      <w:proofErr w:type="spellStart"/>
+      <w:r>
+        <w:rPr>
+          <w:rFonts w:ascii="Courier New" w:eastAsia="Times New Roman" w:hAnsi="Courier New" w:cs="Courier New"/>
+          <w:sz w:val="20"/>
+          <w:szCs w:val="20"/>
+        </w:rPr>
+        <w:t>PriceExporter</w:t>
+      </w:r>
+      <w:proofErr w:type="spellEnd"/>
+      <w:r>
+        <w:rPr>
+          <w:rFonts w:ascii="Times New Roman" w:eastAsia="Times New Roman" w:hAnsi="Times New Roman" w:cs="Times New Roman"/>
+          <w:sz w:val="24"/>
+          <w:szCs w:val="24"/>
+        </w:rPr>
+        <w:t xml:space="preserve"> and the schema. I made a few concrete assumptions to get a working shape down; flagging them below so you can correct anything that's off before we </w:t>
+      </w:r>
+      <w:proofErr w:type="spellStart"/>
+      <w:r>
+        <w:rPr>
+          <w:rFonts w:ascii="Times New Roman" w:eastAsia="Times New Roman" w:hAnsi="Times New Roman" w:cs="Times New Roman"/>
+          <w:sz w:val="24"/>
+          <w:szCs w:val="24"/>
+        </w:rPr>
+        <w:t>iterate.Sample</w:t>
+      </w:r>
+      <w:proofErr w:type="spellEnd"/>
+      <w:r>
+        <w:rPr>
+          <w:rFonts w:ascii="Times New Roman" w:eastAsia="Times New Roman" w:hAnsi="Times New Roman" w:cs="Times New Roman"/>
+          <w:sz w:val="24"/>
+          <w:szCs w:val="24"/>
+        </w:rPr>
+        <w:t xml:space="preserve"> output shape for one section:</w:t>
+      </w:r>
+    </w:p>
+    <w:p>
+      <w:pPr>
+        <w:tabs>
+          <w:tab w:val="left" w:pos="916"/>
+          <w:tab w:val="left" w:pos="1832"/>
+          <w:tab w:val="left" w:pos="2748"/>
+          <w:tab w:val="left" w:pos="3664"/>
+          <w:tab w:val="left" w:pos="4580"/>
+          <w:tab w:val="left" w:pos="5496"/>
+          <w:tab w:val="left" w:pos="6412"/>
+          <w:tab w:val="left" w:pos="7328"/>
+          <w:tab w:val="left" w:pos="8244"/>
+          <w:tab w:val="left" w:pos="9160"/>
+          <w:tab w:val="left" w:pos="10076"/>
+          <w:tab w:val="left" w:pos="10992"/>
+          <w:tab w:val="left" w:pos="11908"/>
+          <w:tab w:val="left" w:pos="12824"/>
+          <w:tab w:val="left" w:pos="13740"/>
+          <w:tab w:val="left" w:pos="14656"/>
+        </w:tabs>
+        <w:spacing w:after="0" w:line="240" w:lineRule="auto"/>
+        <w:rPr>
+          <w:rFonts w:ascii="Courier New" w:eastAsia="Times New Roman" w:hAnsi="Courier New" w:cs="Courier New"/>
+          <w:sz w:val="20"/>
+          <w:szCs w:val="20"/>
+        </w:rPr>
+      </w:pPr>
+      <w:r>
+        <w:rPr>
+          <w:rFonts w:ascii="Courier New" w:eastAsia="Times New Roman" w:hAnsi="Courier New" w:cs="Courier New"/>
+          <w:sz w:val="20"/>
+          <w:szCs w:val="20"/>
+        </w:rPr>
+        <w:t>{</w:t>
+      </w:r>
+    </w:p>
+    <w:p>
+      <w:pPr>
+        <w:tabs>
+          <w:tab w:val="left" w:pos="916"/>
+          <w:tab w:val="left" w:pos="1832"/>
+          <w:tab w:val="left" w:pos="2748"/>
+          <w:tab w:val="left" w:pos="3664"/>
+          <w:tab w:val="left" w:pos="4580"/>
+          <w:tab w:val="left" w:pos="5496"/>
+          <w:tab w:val="left" w:pos="6412"/>
+          <w:tab w:val="left" w:pos="7328"/>
+          <w:tab w:val="left" w:pos="8244"/>
+          <w:tab w:val="left" w:pos="9160"/>
+          <w:tab w:val="left" w:pos="10076"/>
+          <w:tab w:val="left" w:pos="10992"/>
+          <w:tab w:val="left" w:pos="11908"/>
+          <w:tab w:val="left" w:pos="12824"/>
+          <w:tab w:val="left" w:pos="13740"/>
+          <w:tab w:val="left" w:pos="14656"/>
+        </w:tabs>
+        <w:spacing w:after="0" w:line="240" w:lineRule="auto"/>
+        <w:rPr>
+          <w:rFonts w:ascii="Courier New" w:eastAsia="Times New Roman" w:hAnsi="Courier New" w:cs="Courier New"/>
+          <w:sz w:val="20"/>
+          <w:szCs w:val="20"/>
+        </w:rPr>
+      </w:pPr>
+      <w:r>
+        <w:rPr>
+          <w:rFonts w:ascii="Courier New" w:eastAsia="Times New Roman" w:hAnsi="Courier New" w:cs="Courier New"/>
+          <w:sz w:val="20"/>
+          <w:szCs w:val="20"/>
+        </w:rPr>
+        <w:t xml:space="preserve">  "identity</w:t>
+      </w:r>
+      <w:proofErr w:type="gramStart"/>
+      <w:r>
+        <w:rPr>
+          <w:rFonts w:ascii="Courier New" w:eastAsia="Times New Roman" w:hAnsi="Courier New" w:cs="Courier New"/>
+          <w:sz w:val="20"/>
+          <w:szCs w:val="20"/>
+        </w:rPr>
+        <w:t>": {</w:t>
+      </w:r>
+      <w:proofErr w:type="gramEnd"/>
+      <w:r>
+        <w:rPr>
+          <w:rFonts w:ascii="Courier New" w:eastAsia="Times New Roman" w:hAnsi="Courier New" w:cs="Courier New"/>
+          <w:sz w:val="20"/>
+          <w:szCs w:val="20"/>
+        </w:rPr>
+        <w:t>"</w:t>
+      </w:r>
+      <w:proofErr w:type="spellStart"/>
+      <w:r>
+        <w:rPr>
+          <w:rFonts w:ascii="Courier New" w:eastAsia="Times New Roman" w:hAnsi="Courier New" w:cs="Courier New"/>
+          <w:sz w:val="20"/>
+          <w:szCs w:val="20"/>
+        </w:rPr>
+        <w:t>wkb</w:t>
+      </w:r>
+      <w:proofErr w:type="spellEnd"/>
+      <w:r>
+        <w:rPr>
+          <w:rFonts w:ascii="Courier New" w:eastAsia="Times New Roman" w:hAnsi="Courier New" w:cs="Courier New"/>
+          <w:sz w:val="20"/>
+          <w:szCs w:val="20"/>
+        </w:rPr>
+        <w:t>": "snapshot.xlsm", "</w:t>
+      </w:r>
+      <w:proofErr w:type="spellStart"/>
+      <w:r>
+        <w:rPr>
+          <w:rFonts w:ascii="Courier New" w:eastAsia="Times New Roman" w:hAnsi="Courier New" w:cs="Courier New"/>
+          <w:sz w:val="20"/>
+          <w:szCs w:val="20"/>
+        </w:rPr>
+        <w:t>wks</w:t>
+      </w:r>
+      <w:proofErr w:type="spellEnd"/>
+      <w:r>
+        <w:rPr>
+          <w:rFonts w:ascii="Courier New" w:eastAsia="Times New Roman" w:hAnsi="Courier New" w:cs="Courier New"/>
+          <w:sz w:val="20"/>
+          <w:szCs w:val="20"/>
+        </w:rPr>
+        <w:t>": "SNAP", "</w:t>
+      </w:r>
+      <w:proofErr w:type="spellStart"/>
+      <w:r>
+        <w:rPr>
+          <w:rFonts w:ascii="Courier New" w:eastAsia="Times New Roman" w:hAnsi="Courier New" w:cs="Courier New"/>
+          <w:sz w:val="20"/>
+          <w:szCs w:val="20"/>
+        </w:rPr>
+        <w:t>tbl</w:t>
+      </w:r>
+      <w:proofErr w:type="spellEnd"/>
+      <w:r>
+        <w:rPr>
+          <w:rFonts w:ascii="Courier New" w:eastAsia="Times New Roman" w:hAnsi="Courier New" w:cs="Courier New"/>
+          <w:sz w:val="20"/>
+          <w:szCs w:val="20"/>
+        </w:rPr>
+        <w:t>": "</w:t>
+      </w:r>
+      <w:proofErr w:type="spellStart"/>
+      <w:r>
+        <w:rPr>
+          <w:rFonts w:ascii="Courier New" w:eastAsia="Times New Roman" w:hAnsi="Courier New" w:cs="Courier New"/>
+          <w:sz w:val="20"/>
+          <w:szCs w:val="20"/>
+        </w:rPr>
+        <w:t>SnapshotTable</w:t>
+      </w:r>
+      <w:proofErr w:type="spellEnd"/>
+      <w:r>
+        <w:rPr>
+          <w:rFonts w:ascii="Courier New" w:eastAsia="Times New Roman" w:hAnsi="Courier New" w:cs="Courier New"/>
+          <w:sz w:val="20"/>
+          <w:szCs w:val="20"/>
+        </w:rPr>
+        <w:t>", "created": "2026-07-31T14:23:</w:t>
+      </w:r>
+      <w:proofErr w:type="gramStart"/>
+      <w:r>
+        <w:rPr>
+          <w:rFonts w:ascii="Courier New" w:eastAsia="Times New Roman" w:hAnsi="Courier New" w:cs="Courier New"/>
+          <w:sz w:val="20"/>
+          <w:szCs w:val="20"/>
+        </w:rPr>
+        <w:t>01"}</w:t>
+      </w:r>
+      <w:proofErr w:type="gramEnd"/>
+      <w:r>
+        <w:rPr>
+          <w:rFonts w:ascii="Courier New" w:eastAsia="Times New Roman" w:hAnsi="Courier New" w:cs="Courier New"/>
+          <w:sz w:val="20"/>
+          <w:szCs w:val="20"/>
+        </w:rPr>
+        <w:t>,</w:t>
+      </w:r>
+    </w:p>
+    <w:p>
+      <w:pPr>
+        <w:tabs>
+          <w:tab w:val="left" w:pos="916"/>
+          <w:tab w:val="left" w:pos="1832"/>
+          <w:tab w:val="left" w:pos="2748"/>
+          <w:tab w:val="left" w:pos="3664"/>
+          <w:tab w:val="left" w:pos="4580"/>
+          <w:tab w:val="left" w:pos="5496"/>
+          <w:tab w:val="left" w:pos="6412"/>
+          <w:tab w:val="left" w:pos="7328"/>
+          <w:tab w:val="left" w:pos="8244"/>
+          <w:tab w:val="left" w:pos="9160"/>
+          <w:tab w:val="left" w:pos="10076"/>
+          <w:tab w:val="left" w:pos="10992"/>
+          <w:tab w:val="left" w:pos="11908"/>
+          <w:tab w:val="left" w:pos="12824"/>
+          <w:tab w:val="left" w:pos="13740"/>
+          <w:tab w:val="left" w:pos="14656"/>
+        </w:tabs>
+        <w:spacing w:after="0" w:line="240" w:lineRule="auto"/>
+        <w:rPr>
+          <w:rFonts w:ascii="Courier New" w:eastAsia="Times New Roman" w:hAnsi="Courier New" w:cs="Courier New"/>
+          <w:sz w:val="20"/>
+          <w:szCs w:val="20"/>
+        </w:rPr>
+      </w:pPr>
+      <w:r>
+        <w:rPr>
+          <w:rFonts w:ascii="Courier New" w:eastAsia="Times New Roman" w:hAnsi="Courier New" w:cs="Courier New"/>
+          <w:sz w:val="20"/>
+          <w:szCs w:val="20"/>
+        </w:rPr>
+        <w:t xml:space="preserve">  "equity</w:t>
+      </w:r>
+      <w:proofErr w:type="gramStart"/>
+      <w:r>
+        <w:rPr>
+          <w:rFonts w:ascii="Courier New" w:eastAsia="Times New Roman" w:hAnsi="Courier New" w:cs="Courier New"/>
+          <w:sz w:val="20"/>
+          <w:szCs w:val="20"/>
+        </w:rPr>
+        <w:t>": {</w:t>
+      </w:r>
+      <w:proofErr w:type="gramEnd"/>
+    </w:p>
+    <w:p>
+      <w:pPr>
+        <w:tabs>
+          <w:tab w:val="left" w:pos="916"/>
+          <w:tab w:val="left" w:pos="1832"/>
+          <w:tab w:val="left" w:pos="2748"/>
+          <w:tab w:val="left" w:pos="3664"/>
+          <w:tab w:val="left" w:pos="4580"/>
+          <w:tab w:val="left" w:pos="5496"/>
+          <w:tab w:val="left" w:pos="6412"/>
+          <w:tab w:val="left" w:pos="7328"/>
+          <w:tab w:val="left" w:pos="8244"/>
+          <w:tab w:val="left" w:pos="9160"/>
+          <w:tab w:val="left" w:pos="10076"/>
+          <w:tab w:val="left" w:pos="10992"/>
+          <w:tab w:val="left" w:pos="11908"/>
+          <w:tab w:val="left" w:pos="12824"/>
+          <w:tab w:val="left" w:pos="13740"/>
+          <w:tab w:val="left" w:pos="14656"/>
+        </w:tabs>
+        <w:spacing w:after="0" w:line="240" w:lineRule="auto"/>
+        <w:rPr>
+          <w:rFonts w:ascii="Courier New" w:eastAsia="Times New Roman" w:hAnsi="Courier New" w:cs="Courier New"/>
+          <w:sz w:val="20"/>
+          <w:szCs w:val="20"/>
+        </w:rPr>
+      </w:pPr>
+      <w:r>
+        <w:rPr>
+          <w:rFonts w:ascii="Courier New" w:eastAsia="Times New Roman" w:hAnsi="Courier New" w:cs="Courier New"/>
+          <w:sz w:val="20"/>
+          <w:szCs w:val="20"/>
+        </w:rPr>
+        <w:t xml:space="preserve">    "</w:t>
+      </w:r>
+      <w:proofErr w:type="spellStart"/>
+      <w:r>
+        <w:rPr>
+          <w:rFonts w:ascii="Courier New" w:eastAsia="Times New Roman" w:hAnsi="Courier New" w:cs="Courier New"/>
+          <w:sz w:val="20"/>
+          <w:szCs w:val="20"/>
+        </w:rPr>
+        <w:t>symbol_column</w:t>
+      </w:r>
+      <w:proofErr w:type="spellEnd"/>
+      <w:r>
+        <w:rPr>
+          <w:rFonts w:ascii="Courier New" w:eastAsia="Times New Roman" w:hAnsi="Courier New" w:cs="Courier New"/>
+          <w:sz w:val="20"/>
+          <w:szCs w:val="20"/>
+        </w:rPr>
+        <w:t>": "Symbol",</w:t>
+      </w:r>
+    </w:p>
+    <w:p>
+      <w:pPr>
+        <w:tabs>
+          <w:tab w:val="left" w:pos="916"/>
+          <w:tab w:val="left" w:pos="1832"/>
+          <w:tab w:val="left" w:pos="2748"/>
+          <w:tab w:val="left" w:pos="3664"/>
+          <w:tab w:val="left" w:pos="4580"/>
+          <w:tab w:val="left" w:pos="5496"/>
+          <w:tab w:val="left" w:pos="6412"/>
+          <w:tab w:val="left" w:pos="7328"/>
+          <w:tab w:val="left" w:pos="8244"/>
+          <w:tab w:val="left" w:pos="9160"/>
+          <w:tab w:val="left" w:pos="10076"/>
+          <w:tab w:val="left" w:pos="10992"/>
+          <w:tab w:val="left" w:pos="11908"/>
+          <w:tab w:val="left" w:pos="12824"/>
+          <w:tab w:val="left" w:pos="13740"/>
+          <w:tab w:val="left" w:pos="14656"/>
+        </w:tabs>
+        <w:spacing w:after="0" w:line="240" w:lineRule="auto"/>
+        <w:rPr>
+          <w:rFonts w:ascii="Courier New" w:eastAsia="Times New Roman" w:hAnsi="Courier New" w:cs="Courier New"/>
+          <w:sz w:val="20"/>
+          <w:szCs w:val="20"/>
+        </w:rPr>
+      </w:pPr>
+      <w:r>
+        <w:rPr>
+          <w:rFonts w:ascii="Courier New" w:eastAsia="Times New Roman" w:hAnsi="Courier New" w:cs="Courier New"/>
+          <w:sz w:val="20"/>
+          <w:szCs w:val="20"/>
+        </w:rPr>
+        <w:t xml:space="preserve">    "</w:t>
+      </w:r>
+      <w:proofErr w:type="spellStart"/>
+      <w:r>
+        <w:rPr>
+          <w:rFonts w:ascii="Courier New" w:eastAsia="Times New Roman" w:hAnsi="Courier New" w:cs="Courier New"/>
+          <w:sz w:val="20"/>
+          <w:szCs w:val="20"/>
+        </w:rPr>
+        <w:t>target_column</w:t>
+      </w:r>
+      <w:proofErr w:type="spellEnd"/>
+      <w:r>
+        <w:rPr>
+          <w:rFonts w:ascii="Courier New" w:eastAsia="Times New Roman" w:hAnsi="Courier New" w:cs="Courier New"/>
+          <w:sz w:val="20"/>
+          <w:szCs w:val="20"/>
+        </w:rPr>
+        <w:t>": "Last Price",</w:t>
+      </w:r>
+    </w:p>
+    <w:p>
+      <w:pPr>
+        <w:tabs>
+          <w:tab w:val="left" w:pos="916"/>
+          <w:tab w:val="left" w:pos="1832"/>
+          <w:tab w:val="left" w:pos="2748"/>
+          <w:tab w:val="left" w:pos="3664"/>
+          <w:tab w:val="left" w:pos="4580"/>
+          <w:tab w:val="left" w:pos="5496"/>
+          <w:tab w:val="left" w:pos="6412"/>
+          <w:tab w:val="left" w:pos="7328"/>
+          <w:tab w:val="left" w:pos="8244"/>
+          <w:tab w:val="left" w:pos="9160"/>
+          <w:tab w:val="left" w:pos="10076"/>
+          <w:tab w:val="left" w:pos="10992"/>
+          <w:tab w:val="left" w:pos="11908"/>
+          <w:tab w:val="left" w:pos="12824"/>
+          <w:tab w:val="left" w:pos="13740"/>
+          <w:tab w:val="left" w:pos="14656"/>
+        </w:tabs>
+        <w:spacing w:after="0" w:line="240" w:lineRule="auto"/>
+        <w:rPr>
+          <w:rFonts w:ascii="Courier New" w:eastAsia="Times New Roman" w:hAnsi="Courier New" w:cs="Courier New"/>
+          <w:sz w:val="20"/>
+          <w:szCs w:val="20"/>
+        </w:rPr>
+      </w:pPr>
+      <w:r>
+        <w:rPr>
+          <w:rFonts w:ascii="Courier New" w:eastAsia="Times New Roman" w:hAnsi="Courier New" w:cs="Courier New"/>
+          <w:sz w:val="20"/>
+          <w:szCs w:val="20"/>
+        </w:rPr>
+        <w:t xml:space="preserve">    "prices"</w:t>
+      </w:r>
+      <w:proofErr w:type="gramStart"/>
+      <w:r>
+        <w:rPr>
+          <w:rFonts w:ascii="Courier New" w:eastAsia="Times New Roman" w:hAnsi="Courier New" w:cs="Courier New"/>
+          <w:sz w:val="20"/>
+          <w:szCs w:val="20"/>
+        </w:rPr>
+        <w:t>: [{</w:t>
+      </w:r>
+      <w:proofErr w:type="gramEnd"/>
+      <w:r>
+        <w:rPr>
+          <w:rFonts w:ascii="Courier New" w:eastAsia="Times New Roman" w:hAnsi="Courier New" w:cs="Courier New"/>
+          <w:sz w:val="20"/>
+          <w:szCs w:val="20"/>
+        </w:rPr>
+        <w:t xml:space="preserve">"symbol": "AAPL", "price": </w:t>
+      </w:r>
+      <w:proofErr w:type="gramStart"/>
+      <w:r>
+        <w:rPr>
+          <w:rFonts w:ascii="Courier New" w:eastAsia="Times New Roman" w:hAnsi="Courier New" w:cs="Courier New"/>
+          <w:sz w:val="20"/>
+          <w:szCs w:val="20"/>
+        </w:rPr>
+        <w:t>213.45}]</w:t>
+      </w:r>
+      <w:proofErr w:type="gramEnd"/>
+      <w:r>
+        <w:rPr>
+          <w:rFonts w:ascii="Courier New" w:eastAsia="Times New Roman" w:hAnsi="Courier New" w:cs="Courier New"/>
+          <w:sz w:val="20"/>
+          <w:szCs w:val="20"/>
+        </w:rPr>
+        <w:t>,</w:t>
+      </w:r>
+    </w:p>
+    <w:p>
+      <w:pPr>
+        <w:tabs>
+          <w:tab w:val="left" w:pos="916"/>
+          <w:tab w:val="left" w:pos="1832"/>
+          <w:tab w:val="left" w:pos="2748"/>
+          <w:tab w:val="left" w:pos="3664"/>
+          <w:tab w:val="left" w:pos="4580"/>
+          <w:tab w:val="left" w:pos="5496"/>
+          <w:tab w:val="left" w:pos="6412"/>
+          <w:tab w:val="left" w:pos="7328"/>
+          <w:tab w:val="left" w:pos="8244"/>
+          <w:tab w:val="left" w:pos="9160"/>
+          <w:tab w:val="left" w:pos="10076"/>
+          <w:tab w:val="left" w:pos="10992"/>
+          <w:tab w:val="left" w:pos="11908"/>
+          <w:tab w:val="left" w:pos="12824"/>
+          <w:tab w:val="left" w:pos="13740"/>
+          <w:tab w:val="left" w:pos="14656"/>
+        </w:tabs>
+        <w:spacing w:after="0" w:line="240" w:lineRule="auto"/>
+        <w:rPr>
+          <w:rFonts w:ascii="Courier New" w:eastAsia="Times New Roman" w:hAnsi="Courier New" w:cs="Courier New"/>
+          <w:sz w:val="20"/>
+          <w:szCs w:val="20"/>
+        </w:rPr>
+      </w:pPr>
+      <w:r>
+        <w:rPr>
+          <w:rFonts w:ascii="Courier New" w:eastAsia="Times New Roman" w:hAnsi="Courier New" w:cs="Courier New"/>
+          <w:sz w:val="20"/>
+          <w:szCs w:val="20"/>
+        </w:rPr>
+        <w:t xml:space="preserve">    "summary</w:t>
+      </w:r>
+      <w:proofErr w:type="gramStart"/>
+      <w:r>
+        <w:rPr>
+          <w:rFonts w:ascii="Courier New" w:eastAsia="Times New Roman" w:hAnsi="Courier New" w:cs="Courier New"/>
+          <w:sz w:val="20"/>
+          <w:szCs w:val="20"/>
+        </w:rPr>
+        <w:t>": {</w:t>
+      </w:r>
+      <w:proofErr w:type="gramEnd"/>
+      <w:r>
+        <w:rPr>
+          <w:rFonts w:ascii="Courier New" w:eastAsia="Times New Roman" w:hAnsi="Courier New" w:cs="Courier New"/>
+          <w:sz w:val="20"/>
+          <w:szCs w:val="20"/>
+        </w:rPr>
+        <w:t>"total": 10, "succeeded": 9, "failed": 1, "</w:t>
+      </w:r>
+      <w:proofErr w:type="spellStart"/>
+      <w:r>
+        <w:rPr>
+          <w:rFonts w:ascii="Courier New" w:eastAsia="Times New Roman" w:hAnsi="Courier New" w:cs="Courier New"/>
+          <w:sz w:val="20"/>
+          <w:szCs w:val="20"/>
+        </w:rPr>
+        <w:t>failed_symbols</w:t>
+      </w:r>
+      <w:proofErr w:type="spellEnd"/>
+      <w:r>
+        <w:rPr>
+          <w:rFonts w:ascii="Courier New" w:eastAsia="Times New Roman" w:hAnsi="Courier New" w:cs="Courier New"/>
+          <w:sz w:val="20"/>
+          <w:szCs w:val="20"/>
+        </w:rPr>
+        <w:t>": ["XYZ</w:t>
+      </w:r>
+      <w:proofErr w:type="gramStart"/>
+      <w:r>
+        <w:rPr>
+          <w:rFonts w:ascii="Courier New" w:eastAsia="Times New Roman" w:hAnsi="Courier New" w:cs="Courier New"/>
+          <w:sz w:val="20"/>
+          <w:szCs w:val="20"/>
+        </w:rPr>
+        <w:t>"]}</w:t>
+      </w:r>
+      <w:proofErr w:type="gramEnd"/>
+    </w:p>
+    <w:p>
+      <w:pPr>
+        <w:tabs>
+          <w:tab w:val="left" w:pos="916"/>
+          <w:tab w:val="left" w:pos="1832"/>
+          <w:tab w:val="left" w:pos="2748"/>
+          <w:tab w:val="left" w:pos="3664"/>
+          <w:tab w:val="left" w:pos="4580"/>
+          <w:tab w:val="left" w:pos="5496"/>
+          <w:tab w:val="left" w:pos="6412"/>
+          <w:tab w:val="left" w:pos="7328"/>
+          <w:tab w:val="left" w:pos="8244"/>
+          <w:tab w:val="left" w:pos="9160"/>
+          <w:tab w:val="left" w:pos="10076"/>
+          <w:tab w:val="left" w:pos="10992"/>
+          <w:tab w:val="left" w:pos="11908"/>
+          <w:tab w:val="left" w:pos="12824"/>
+          <w:tab w:val="left" w:pos="13740"/>
+          <w:tab w:val="left" w:pos="14656"/>
+        </w:tabs>
+        <w:spacing w:after="0" w:line="240" w:lineRule="auto"/>
+        <w:rPr>
+          <w:rFonts w:ascii="Courier New" w:eastAsia="Times New Roman" w:hAnsi="Courier New" w:cs="Courier New"/>
+          <w:sz w:val="20"/>
+          <w:szCs w:val="20"/>
+        </w:rPr>
+      </w:pPr>
+      <w:r>
+        <w:rPr>
+          <w:rFonts w:ascii="Courier New" w:eastAsia="Times New Roman" w:hAnsi="Courier New" w:cs="Courier New"/>
+          <w:sz w:val="20"/>
+          <w:szCs w:val="20"/>
+        </w:rPr>
+        <w:t xml:space="preserve">  }</w:t>
+      </w:r>
+    </w:p>
+    <w:p>
+      <w:pPr>
+        <w:tabs>
+          <w:tab w:val="left" w:pos="916"/>
+          <w:tab w:val="left" w:pos="1832"/>
+          <w:tab w:val="left" w:pos="2748"/>
+          <w:tab w:val="left" w:pos="3664"/>
+          <w:tab w:val="left" w:pos="4580"/>
+          <w:tab w:val="left" w:pos="5496"/>
+          <w:tab w:val="left" w:pos="6412"/>
+          <w:tab w:val="left" w:pos="7328"/>
+          <w:tab w:val="left" w:pos="8244"/>
+          <w:tab w:val="left" w:pos="9160"/>
+          <w:tab w:val="left" w:pos="10076"/>
+          <w:tab w:val="left" w:pos="10992"/>
+          <w:tab w:val="left" w:pos="11908"/>
+          <w:tab w:val="left" w:pos="12824"/>
+          <w:tab w:val="left" w:pos="13740"/>
+          <w:tab w:val="left" w:pos="14656"/>
+        </w:tabs>
+        <w:spacing w:after="0" w:line="240" w:lineRule="auto"/>
+        <w:rPr>
+          <w:rFonts w:ascii="Courier New" w:eastAsia="Times New Roman" w:hAnsi="Courier New" w:cs="Courier New"/>
+          <w:sz w:val="20"/>
+          <w:szCs w:val="20"/>
+        </w:rPr>
+      </w:pPr>
+      <w:r>
+        <w:rPr>
+          <w:rFonts w:ascii="Courier New" w:eastAsia="Times New Roman" w:hAnsi="Courier New" w:cs="Courier New"/>
+          <w:sz w:val="20"/>
+          <w:szCs w:val="20"/>
+        </w:rPr>
+        <w:t>}</w:t>
+      </w:r>
+    </w:p>
+    <w:p>
+      <w:pPr>
+        <w:spacing w:before="100" w:beforeAutospacing="1" w:after="100" w:afterAutospacing="1" w:line="240" w:lineRule="auto"/>
+        <w:rPr>
+          <w:rFonts w:ascii="Times New Roman" w:eastAsia="Times New Roman" w:hAnsi="Times New Roman" w:cs="Times New Roman"/>
+          <w:sz w:val="24"/>
+          <w:szCs w:val="24"/>
+        </w:rPr>
+      </w:pPr>
+      <w:r>
+        <w:rPr>
+          <w:rFonts w:ascii="Times New Roman" w:eastAsia="Times New Roman" w:hAnsi="Times New Roman" w:cs="Times New Roman"/>
+          <w:sz w:val="24"/>
+          <w:szCs w:val="24"/>
+        </w:rPr>
+        <w:t>Assumptions baked in that you should check before this drops into the project:</w:t>
+      </w:r>
+    </w:p>
+    <w:p>
+      <w:pPr>
+        <w:numPr>
+          <w:ilvl w:val="0"/>
+          <w:numId w:val="4"/>
+        </w:numPr>
+        <w:spacing w:before="100" w:beforeAutospacing="1" w:after="100" w:afterAutospacing="1" w:line="240" w:lineRule="auto"/>
+        <w:rPr>
+          <w:rFonts w:ascii="Times New Roman" w:eastAsia="Times New Roman" w:hAnsi="Times New Roman" w:cs="Times New Roman"/>
+          <w:sz w:val="24"/>
+          <w:szCs w:val="24"/>
+        </w:rPr>
+      </w:pPr>
+      <w:proofErr w:type="spellStart"/>
+      <w:r>
+        <w:rPr>
+          <w:rFonts w:ascii="Courier New" w:eastAsia="Times New Roman" w:hAnsi="Courier New" w:cs="Courier New"/>
+          <w:b/>
+          <w:bCs/>
+          <w:sz w:val="20"/>
+          <w:szCs w:val="20"/>
+        </w:rPr>
+        <w:t>PriceUpdateResult</w:t>
+      </w:r>
+      <w:proofErr w:type="spellEnd"/>
+      <w:r>
+        <w:rPr>
+          <w:rFonts w:ascii="Times New Roman" w:eastAsia="Times New Roman" w:hAnsi="Times New Roman" w:cs="Times New Roman"/>
+          <w:b/>
+          <w:bCs/>
+          <w:sz w:val="24"/>
+          <w:szCs w:val="24"/>
+        </w:rPr>
+        <w:t xml:space="preserve"> fields</w:t>
+      </w:r>
+      <w:r>
+        <w:rPr>
+          <w:rFonts w:ascii="Times New Roman" w:eastAsia="Times New Roman" w:hAnsi="Times New Roman" w:cs="Times New Roman"/>
+          <w:sz w:val="24"/>
+          <w:szCs w:val="24"/>
+        </w:rPr>
+        <w:t xml:space="preserve"> — I assumed </w:t>
+      </w:r>
+      <w:r>
+        <w:rPr>
+          <w:rFonts w:ascii="Courier New" w:eastAsia="Times New Roman" w:hAnsi="Courier New" w:cs="Courier New"/>
+          <w:sz w:val="20"/>
+          <w:szCs w:val="20"/>
+        </w:rPr>
+        <w:t>.symbol</w:t>
+      </w:r>
+      <w:r>
+        <w:rPr>
+          <w:rFonts w:ascii="Times New Roman" w:eastAsia="Times New Roman" w:hAnsi="Times New Roman" w:cs="Times New Roman"/>
+          <w:sz w:val="24"/>
+          <w:szCs w:val="24"/>
+        </w:rPr>
+        <w:t xml:space="preserve">, </w:t>
+      </w:r>
+      <w:r>
+        <w:rPr>
+          <w:rFonts w:ascii="Courier New" w:eastAsia="Times New Roman" w:hAnsi="Courier New" w:cs="Courier New"/>
+          <w:sz w:val="20"/>
+          <w:szCs w:val="20"/>
+        </w:rPr>
+        <w:t>.price</w:t>
+      </w:r>
+      <w:r>
+        <w:rPr>
+          <w:rFonts w:ascii="Times New Roman" w:eastAsia="Times New Roman" w:hAnsi="Times New Roman" w:cs="Times New Roman"/>
+          <w:sz w:val="24"/>
+          <w:szCs w:val="24"/>
+        </w:rPr>
+        <w:t xml:space="preserve">, </w:t>
+      </w:r>
+      <w:r>
+        <w:rPr>
+          <w:rFonts w:ascii="Courier New" w:eastAsia="Times New Roman" w:hAnsi="Courier New" w:cs="Courier New"/>
+          <w:sz w:val="20"/>
+          <w:szCs w:val="20"/>
+        </w:rPr>
+        <w:t>.success</w:t>
+      </w:r>
+      <w:r>
+        <w:rPr>
+          <w:rFonts w:ascii="Times New Roman" w:eastAsia="Times New Roman" w:hAnsi="Times New Roman" w:cs="Times New Roman"/>
+          <w:sz w:val="24"/>
+          <w:szCs w:val="24"/>
+        </w:rPr>
+        <w:t xml:space="preserve">. If the real attribute names differ, </w:t>
+      </w:r>
+      <w:r>
+        <w:rPr>
+          <w:rFonts w:ascii="Courier New" w:eastAsia="Times New Roman" w:hAnsi="Courier New" w:cs="Courier New"/>
+          <w:sz w:val="20"/>
+          <w:szCs w:val="20"/>
+        </w:rPr>
+        <w:t>_</w:t>
+      </w:r>
+      <w:proofErr w:type="spellStart"/>
+      <w:r>
+        <w:rPr>
+          <w:rFonts w:ascii="Courier New" w:eastAsia="Times New Roman" w:hAnsi="Courier New" w:cs="Courier New"/>
+          <w:sz w:val="20"/>
+          <w:szCs w:val="20"/>
+        </w:rPr>
+        <w:t>build_section</w:t>
+      </w:r>
+      <w:proofErr w:type="spellEnd"/>
+      <w:r>
+        <w:rPr>
+          <w:rFonts w:ascii="Times New Roman" w:eastAsia="Times New Roman" w:hAnsi="Times New Roman" w:cs="Times New Roman"/>
+          <w:sz w:val="24"/>
+          <w:szCs w:val="24"/>
+        </w:rPr>
+        <w:t xml:space="preserve"> needs a one-line adjustment, nothing structural.</w:t>
+      </w:r>
+    </w:p>
+    <w:p>
+      <w:pPr>
+        <w:numPr>
+          <w:ilvl w:val="0"/>
+          <w:numId w:val="4"/>
+        </w:numPr>
+        <w:spacing w:before="100" w:beforeAutospacing="1" w:after="100" w:afterAutospacing="1" w:line="240" w:lineRule="auto"/>
+        <w:rPr>
+          <w:rFonts w:ascii="Times New Roman" w:eastAsia="Times New Roman" w:hAnsi="Times New Roman" w:cs="Times New Roman"/>
+          <w:sz w:val="24"/>
+          <w:szCs w:val="24"/>
+        </w:rPr>
+      </w:pPr>
+      <w:r>
+        <w:rPr>
+          <w:rFonts w:ascii="Times New Roman" w:eastAsia="Times New Roman" w:hAnsi="Times New Roman" w:cs="Times New Roman"/>
+          <w:b/>
+          <w:bCs/>
+          <w:sz w:val="24"/>
+          <w:szCs w:val="24"/>
+        </w:rPr>
+        <w:t>Import paths</w:t>
+      </w:r>
+      <w:r>
+        <w:rPr>
+          <w:rFonts w:ascii="Times New Roman" w:eastAsia="Times New Roman" w:hAnsi="Times New Roman" w:cs="Times New Roman"/>
+          <w:sz w:val="24"/>
+          <w:szCs w:val="24"/>
+        </w:rPr>
+        <w:t xml:space="preserve"> — </w:t>
+      </w:r>
+      <w:proofErr w:type="spellStart"/>
+      <w:r>
+        <w:rPr>
+          <w:rFonts w:ascii="Courier New" w:eastAsia="Times New Roman" w:hAnsi="Courier New" w:cs="Courier New"/>
+          <w:sz w:val="20"/>
+          <w:szCs w:val="20"/>
+        </w:rPr>
+        <w:t>ebf_data.paths.ProjectFileLocator</w:t>
+      </w:r>
+      <w:proofErr w:type="spellEnd"/>
+      <w:r>
+        <w:rPr>
+          <w:rFonts w:ascii="Times New Roman" w:eastAsia="Times New Roman" w:hAnsi="Times New Roman" w:cs="Times New Roman"/>
+          <w:sz w:val="24"/>
+          <w:szCs w:val="24"/>
+        </w:rPr>
+        <w:t xml:space="preserve"> and </w:t>
+      </w:r>
+      <w:proofErr w:type="spellStart"/>
+      <w:r>
+        <w:rPr>
+          <w:rFonts w:ascii="Courier New" w:eastAsia="Times New Roman" w:hAnsi="Courier New" w:cs="Courier New"/>
+          <w:sz w:val="20"/>
+          <w:szCs w:val="20"/>
+        </w:rPr>
+        <w:t>ebf_data.pricing.price_update_result.PriceUpdateResult</w:t>
+      </w:r>
+      <w:proofErr w:type="spellEnd"/>
+      <w:r>
+        <w:rPr>
+          <w:rFonts w:ascii="Times New Roman" w:eastAsia="Times New Roman" w:hAnsi="Times New Roman" w:cs="Times New Roman"/>
+          <w:sz w:val="24"/>
+          <w:szCs w:val="24"/>
+        </w:rPr>
+        <w:t xml:space="preserve"> are placeholders; swap for the real module paths.</w:t>
+      </w:r>
+    </w:p>
+    <w:p>
+      <w:pPr>
+        <w:numPr>
+          <w:ilvl w:val="0"/>
+          <w:numId w:val="4"/>
+        </w:numPr>
+        <w:spacing w:before="100" w:beforeAutospacing="1" w:after="100" w:afterAutospacing="1" w:line="240" w:lineRule="auto"/>
+        <w:rPr>
+          <w:rFonts w:ascii="Times New Roman" w:eastAsia="Times New Roman" w:hAnsi="Times New Roman" w:cs="Times New Roman"/>
+          <w:sz w:val="24"/>
+          <w:szCs w:val="24"/>
+        </w:rPr>
+      </w:pPr>
+      <w:r>
+        <w:rPr>
+          <w:rFonts w:ascii="Times New Roman" w:eastAsia="Times New Roman" w:hAnsi="Times New Roman" w:cs="Times New Roman"/>
+          <w:b/>
+          <w:bCs/>
+          <w:sz w:val="24"/>
+          <w:szCs w:val="24"/>
+        </w:rPr>
+        <w:t xml:space="preserve">Section keys are </w:t>
+      </w:r>
+      <w:proofErr w:type="spellStart"/>
+      <w:r>
+        <w:rPr>
+          <w:rFonts w:ascii="Times New Roman" w:eastAsia="Times New Roman" w:hAnsi="Times New Roman" w:cs="Times New Roman"/>
+          <w:b/>
+          <w:bCs/>
+          <w:sz w:val="24"/>
+          <w:szCs w:val="24"/>
+        </w:rPr>
+        <w:t>snake_case</w:t>
+      </w:r>
+      <w:proofErr w:type="spellEnd"/>
+      <w:r>
+        <w:rPr>
+          <w:rFonts w:ascii="Times New Roman" w:eastAsia="Times New Roman" w:hAnsi="Times New Roman" w:cs="Times New Roman"/>
+          <w:sz w:val="24"/>
+          <w:szCs w:val="24"/>
+        </w:rPr>
+        <w:t xml:space="preserve"> (</w:t>
+      </w:r>
+      <w:proofErr w:type="spellStart"/>
+      <w:r>
+        <w:rPr>
+          <w:rFonts w:ascii="Courier New" w:eastAsia="Times New Roman" w:hAnsi="Courier New" w:cs="Courier New"/>
+          <w:sz w:val="20"/>
+          <w:szCs w:val="20"/>
+        </w:rPr>
+        <w:t>short_calls</w:t>
+      </w:r>
+      <w:proofErr w:type="spellEnd"/>
+      <w:r>
+        <w:rPr>
+          <w:rFonts w:ascii="Times New Roman" w:eastAsia="Times New Roman" w:hAnsi="Times New Roman" w:cs="Times New Roman"/>
+          <w:sz w:val="24"/>
+          <w:szCs w:val="24"/>
+        </w:rPr>
+        <w:t xml:space="preserve">, not </w:t>
+      </w:r>
+      <w:r>
+        <w:rPr>
+          <w:rFonts w:ascii="Courier New" w:eastAsia="Times New Roman" w:hAnsi="Courier New" w:cs="Courier New"/>
+          <w:sz w:val="20"/>
+          <w:szCs w:val="20"/>
+        </w:rPr>
+        <w:t>"Short Calls</w:t>
+      </w:r>
+      <w:proofErr w:type="gramStart"/>
+      <w:r>
+        <w:rPr>
+          <w:rFonts w:ascii="Courier New" w:eastAsia="Times New Roman" w:hAnsi="Courier New" w:cs="Courier New"/>
+          <w:sz w:val="20"/>
+          <w:szCs w:val="20"/>
+        </w:rPr>
+        <w:t>"</w:t>
+      </w:r>
+      <w:r>
+        <w:rPr>
+          <w:rFonts w:ascii="Times New Roman" w:eastAsia="Times New Roman" w:hAnsi="Times New Roman" w:cs="Times New Roman"/>
+          <w:sz w:val="24"/>
+          <w:szCs w:val="24"/>
+        </w:rPr>
+        <w:t>) —</w:t>
+      </w:r>
+      <w:proofErr w:type="gramEnd"/>
+      <w:r>
+        <w:rPr>
+          <w:rFonts w:ascii="Times New Roman" w:eastAsia="Times New Roman" w:hAnsi="Times New Roman" w:cs="Times New Roman"/>
+          <w:sz w:val="24"/>
+          <w:szCs w:val="24"/>
+        </w:rPr>
+        <w:t xml:space="preserve"> cleaner for whatever VBA JSON parser you're using (bracket access on a string key with a space works fine in most VBA-JSON libraries, but </w:t>
+      </w:r>
+      <w:proofErr w:type="spellStart"/>
+      <w:r>
+        <w:rPr>
+          <w:rFonts w:ascii="Times New Roman" w:eastAsia="Times New Roman" w:hAnsi="Times New Roman" w:cs="Times New Roman"/>
+          <w:sz w:val="24"/>
+          <w:szCs w:val="24"/>
+        </w:rPr>
+        <w:t>snake_case</w:t>
+      </w:r>
+      <w:proofErr w:type="spellEnd"/>
+      <w:r>
+        <w:rPr>
+          <w:rFonts w:ascii="Times New Roman" w:eastAsia="Times New Roman" w:hAnsi="Times New Roman" w:cs="Times New Roman"/>
+          <w:sz w:val="24"/>
+          <w:szCs w:val="24"/>
+        </w:rPr>
+        <w:t xml:space="preserve"> avoids the question entirely). Say the word if you'd rather match the spec's title-case section names exactly.</w:t>
+      </w:r>
+    </w:p>
+    <w:p>
+      <w:pPr>
+        <w:numPr>
+          <w:ilvl w:val="0"/>
+          <w:numId w:val="4"/>
+        </w:numPr>
+        <w:spacing w:before="100" w:beforeAutospacing="1" w:after="100" w:afterAutospacing="1" w:line="240" w:lineRule="auto"/>
+        <w:rPr>
+          <w:rFonts w:ascii="Times New Roman" w:eastAsia="Times New Roman" w:hAnsi="Times New Roman" w:cs="Times New Roman"/>
+          <w:sz w:val="24"/>
+          <w:szCs w:val="24"/>
+        </w:rPr>
+      </w:pPr>
+      <w:r>
+        <w:rPr>
+          <w:rFonts w:ascii="Courier New" w:eastAsia="Times New Roman" w:hAnsi="Courier New" w:cs="Courier New"/>
+          <w:b/>
+          <w:bCs/>
+          <w:sz w:val="20"/>
+          <w:szCs w:val="20"/>
+        </w:rPr>
+        <w:t>created</w:t>
+      </w:r>
+      <w:r>
+        <w:rPr>
+          <w:rFonts w:ascii="Times New Roman" w:eastAsia="Times New Roman" w:hAnsi="Times New Roman" w:cs="Times New Roman"/>
+          <w:b/>
+          <w:bCs/>
+          <w:sz w:val="24"/>
+          <w:szCs w:val="24"/>
+        </w:rPr>
+        <w:t xml:space="preserve"> is </w:t>
+      </w:r>
+      <w:proofErr w:type="spellStart"/>
+      <w:proofErr w:type="gramStart"/>
+      <w:r>
+        <w:rPr>
+          <w:rFonts w:ascii="Courier New" w:eastAsia="Times New Roman" w:hAnsi="Courier New" w:cs="Courier New"/>
+          <w:b/>
+          <w:bCs/>
+          <w:sz w:val="20"/>
+          <w:szCs w:val="20"/>
+        </w:rPr>
+        <w:t>datetime.now</w:t>
+      </w:r>
+      <w:proofErr w:type="spellEnd"/>
+      <w:r>
+        <w:rPr>
+          <w:rFonts w:ascii="Courier New" w:eastAsia="Times New Roman" w:hAnsi="Courier New" w:cs="Courier New"/>
+          <w:b/>
+          <w:bCs/>
+          <w:sz w:val="20"/>
+          <w:szCs w:val="20"/>
+        </w:rPr>
+        <w:t>().</w:t>
+      </w:r>
+      <w:proofErr w:type="spellStart"/>
+      <w:proofErr w:type="gramEnd"/>
+      <w:r>
+        <w:rPr>
+          <w:rFonts w:ascii="Courier New" w:eastAsia="Times New Roman" w:hAnsi="Courier New" w:cs="Courier New"/>
+          <w:b/>
+          <w:bCs/>
+          <w:sz w:val="20"/>
+          <w:szCs w:val="20"/>
+        </w:rPr>
+        <w:t>isoformat</w:t>
+      </w:r>
+      <w:proofErr w:type="spellEnd"/>
+      <w:proofErr w:type="gramStart"/>
+      <w:r>
+        <w:rPr>
+          <w:rFonts w:ascii="Courier New" w:eastAsia="Times New Roman" w:hAnsi="Courier New" w:cs="Courier New"/>
+          <w:b/>
+          <w:bCs/>
+          <w:sz w:val="20"/>
+          <w:szCs w:val="20"/>
+        </w:rPr>
+        <w:t>()</w:t>
+      </w:r>
+      <w:r>
+        <w:rPr>
+          <w:rFonts w:ascii="Times New Roman" w:eastAsia="Times New Roman" w:hAnsi="Times New Roman" w:cs="Times New Roman"/>
+          <w:sz w:val="24"/>
+          <w:szCs w:val="24"/>
+        </w:rPr>
+        <w:t xml:space="preserve"> —</w:t>
+      </w:r>
+      <w:proofErr w:type="gramEnd"/>
+      <w:r>
+        <w:rPr>
+          <w:rFonts w:ascii="Times New Roman" w:eastAsia="Times New Roman" w:hAnsi="Times New Roman" w:cs="Times New Roman"/>
+          <w:sz w:val="24"/>
+          <w:szCs w:val="24"/>
+        </w:rPr>
+        <w:t xml:space="preserve"> flag if VBA needs a specific format (e.g. Excel-</w:t>
+      </w:r>
+      <w:proofErr w:type="spellStart"/>
+      <w:r>
+        <w:rPr>
+          <w:rFonts w:ascii="Times New Roman" w:eastAsia="Times New Roman" w:hAnsi="Times New Roman" w:cs="Times New Roman"/>
+          <w:sz w:val="24"/>
+          <w:szCs w:val="24"/>
+        </w:rPr>
+        <w:t>parseable</w:t>
+      </w:r>
+      <w:proofErr w:type="spellEnd"/>
+      <w:r>
+        <w:rPr>
+          <w:rFonts w:ascii="Times New Roman" w:eastAsia="Times New Roman" w:hAnsi="Times New Roman" w:cs="Times New Roman"/>
+          <w:sz w:val="24"/>
+          <w:szCs w:val="24"/>
+        </w:rPr>
+        <w:t xml:space="preserve"> string vs ISO 8601).</w:t>
+      </w:r>
+    </w:p>
+    <w:p>
+      <w:pPr>
+        <w:numPr>
+          <w:ilvl w:val="0"/>
+          <w:numId w:val="4"/>
+        </w:numPr>
+        <w:spacing w:before="100" w:beforeAutospacing="1" w:after="100" w:afterAutospacing="1" w:line="240" w:lineRule="auto"/>
+        <w:rPr>
+          <w:rFonts w:ascii="Times New Roman" w:eastAsia="Times New Roman" w:hAnsi="Times New Roman" w:cs="Times New Roman"/>
+          <w:sz w:val="24"/>
+          <w:szCs w:val="24"/>
+        </w:rPr>
+      </w:pPr>
+      <w:r>
+        <w:rPr>
+          <w:rFonts w:ascii="Times New Roman" w:eastAsia="Times New Roman" w:hAnsi="Times New Roman" w:cs="Times New Roman"/>
+          <w:b/>
+          <w:bCs/>
+          <w:sz w:val="24"/>
+          <w:szCs w:val="24"/>
+        </w:rPr>
+        <w:lastRenderedPageBreak/>
+        <w:t xml:space="preserve">Filename is the workbook stem + </w:t>
+      </w:r>
+      <w:r>
+        <w:rPr>
+          <w:rFonts w:ascii="Courier New" w:eastAsia="Times New Roman" w:hAnsi="Courier New" w:cs="Courier New"/>
+          <w:b/>
+          <w:bCs/>
+          <w:sz w:val="20"/>
+          <w:szCs w:val="20"/>
+        </w:rPr>
+        <w:t>.</w:t>
+      </w:r>
+      <w:proofErr w:type="spellStart"/>
+      <w:r>
+        <w:rPr>
+          <w:rFonts w:ascii="Courier New" w:eastAsia="Times New Roman" w:hAnsi="Courier New" w:cs="Courier New"/>
+          <w:b/>
+          <w:bCs/>
+          <w:sz w:val="20"/>
+          <w:szCs w:val="20"/>
+        </w:rPr>
+        <w:t>json</w:t>
+      </w:r>
+      <w:proofErr w:type="spellEnd"/>
+      <w:r>
+        <w:rPr>
+          <w:rFonts w:ascii="Times New Roman" w:eastAsia="Times New Roman" w:hAnsi="Times New Roman" w:cs="Times New Roman"/>
+          <w:sz w:val="24"/>
+          <w:szCs w:val="24"/>
+        </w:rPr>
+        <w:t xml:space="preserve"> — now that scenario workbooks won't have spaces, this stays simple. One production workbook and one merged all-option-types scenario workbook won't collide since their stems differ.</w:t>
+      </w:r>
+    </w:p>
+    <w:p>
+      <w:pPr>
+        <w:numPr>
+          <w:ilvl w:val="0"/>
+          <w:numId w:val="4"/>
+        </w:numPr>
+        <w:spacing w:before="100" w:beforeAutospacing="1" w:after="100" w:afterAutospacing="1" w:line="240" w:lineRule="auto"/>
+        <w:rPr>
+          <w:rFonts w:ascii="Times New Roman" w:eastAsia="Times New Roman" w:hAnsi="Times New Roman" w:cs="Times New Roman"/>
+          <w:sz w:val="24"/>
+          <w:szCs w:val="24"/>
+        </w:rPr>
+      </w:pPr>
+      <w:r>
+        <w:rPr>
+          <w:rFonts w:ascii="Times New Roman" w:eastAsia="Times New Roman" w:hAnsi="Times New Roman" w:cs="Times New Roman"/>
+          <w:b/>
+          <w:bCs/>
+          <w:sz w:val="24"/>
+          <w:szCs w:val="24"/>
+        </w:rPr>
+        <w:t xml:space="preserve">No </w:t>
+      </w:r>
+      <w:proofErr w:type="spellStart"/>
+      <w:r>
+        <w:rPr>
+          <w:rFonts w:ascii="Courier New" w:eastAsia="Times New Roman" w:hAnsi="Courier New" w:cs="Courier New"/>
+          <w:b/>
+          <w:bCs/>
+          <w:sz w:val="20"/>
+          <w:szCs w:val="20"/>
+        </w:rPr>
+        <w:t>existing_price</w:t>
+      </w:r>
+      <w:proofErr w:type="spellEnd"/>
+      <w:r>
+        <w:rPr>
+          <w:rFonts w:ascii="Times New Roman" w:eastAsia="Times New Roman" w:hAnsi="Times New Roman" w:cs="Times New Roman"/>
+          <w:b/>
+          <w:bCs/>
+          <w:sz w:val="24"/>
+          <w:szCs w:val="24"/>
+        </w:rPr>
+        <w:t xml:space="preserve"> field anywhere</w:t>
+      </w:r>
+      <w:r>
+        <w:rPr>
+          <w:rFonts w:ascii="Times New Roman" w:eastAsia="Times New Roman" w:hAnsi="Times New Roman" w:cs="Times New Roman"/>
+          <w:sz w:val="24"/>
+          <w:szCs w:val="24"/>
+        </w:rPr>
+        <w:t xml:space="preserve"> — matches your "VBA just skips failures" call from the image; the entry is just absent from </w:t>
+      </w:r>
+      <w:r>
+        <w:rPr>
+          <w:rFonts w:ascii="Courier New" w:eastAsia="Times New Roman" w:hAnsi="Courier New" w:cs="Courier New"/>
+          <w:sz w:val="20"/>
+          <w:szCs w:val="20"/>
+        </w:rPr>
+        <w:t>prices</w:t>
+      </w:r>
+      <w:r>
+        <w:rPr>
+          <w:rFonts w:ascii="Times New Roman" w:eastAsia="Times New Roman" w:hAnsi="Times New Roman" w:cs="Times New Roman"/>
+          <w:sz w:val="24"/>
+          <w:szCs w:val="24"/>
+        </w:rPr>
+        <w:t xml:space="preserve"> for that symbol.</w:t>
+      </w:r>
+    </w:p>
+    <w:p>
+      <w:pPr>
+        <w:spacing w:before="100" w:beforeAutospacing="1" w:after="100" w:afterAutospacing="1" w:line="240" w:lineRule="auto"/>
+        <w:rPr>
+          <w:rFonts w:ascii="Times New Roman" w:eastAsia="Times New Roman" w:hAnsi="Times New Roman" w:cs="Times New Roman"/>
+          <w:sz w:val="24"/>
+          <w:szCs w:val="24"/>
+        </w:rPr>
+      </w:pPr>
+      <w:r>
+        <w:rPr>
+          <w:rFonts w:ascii="Times New Roman" w:eastAsia="Times New Roman" w:hAnsi="Times New Roman" w:cs="Times New Roman"/>
+          <w:sz w:val="24"/>
+          <w:szCs w:val="24"/>
+        </w:rPr>
+        <w:t>Two things worth deciding now since they touch the exporter's public shape:</w:t>
+      </w:r>
+    </w:p>
+    <w:p>
+      <w:pPr>
+        <w:numPr>
+          <w:ilvl w:val="0"/>
+          <w:numId w:val="5"/>
+        </w:numPr>
+        <w:spacing w:before="100" w:beforeAutospacing="1" w:after="100" w:afterAutospacing="1" w:line="240" w:lineRule="auto"/>
+        <w:rPr>
+          <w:rFonts w:ascii="Times New Roman" w:eastAsia="Times New Roman" w:hAnsi="Times New Roman" w:cs="Times New Roman"/>
+          <w:sz w:val="24"/>
+          <w:szCs w:val="24"/>
+        </w:rPr>
+      </w:pPr>
+      <w:r>
+        <w:rPr>
+          <w:rFonts w:ascii="Times New Roman" w:eastAsia="Times New Roman" w:hAnsi="Times New Roman" w:cs="Times New Roman"/>
+          <w:sz w:val="24"/>
+          <w:szCs w:val="24"/>
+        </w:rPr>
+        <w:t xml:space="preserve">Do you want </w:t>
+      </w:r>
+      <w:r>
+        <w:rPr>
+          <w:rFonts w:ascii="Courier New" w:eastAsia="Times New Roman" w:hAnsi="Courier New" w:cs="Courier New"/>
+          <w:sz w:val="20"/>
+          <w:szCs w:val="20"/>
+        </w:rPr>
+        <w:t>export()</w:t>
+      </w:r>
+      <w:r>
+        <w:rPr>
+          <w:rFonts w:ascii="Times New Roman" w:eastAsia="Times New Roman" w:hAnsi="Times New Roman" w:cs="Times New Roman"/>
+          <w:sz w:val="24"/>
+          <w:szCs w:val="24"/>
+        </w:rPr>
+        <w:t xml:space="preserve"> to accept the five result sequences directly (current signature), or would it be cleaner for </w:t>
+      </w:r>
+      <w:proofErr w:type="spellStart"/>
+      <w:r>
+        <w:rPr>
+          <w:rFonts w:ascii="Courier New" w:eastAsia="Times New Roman" w:hAnsi="Courier New" w:cs="Courier New"/>
+          <w:sz w:val="20"/>
+          <w:szCs w:val="20"/>
+        </w:rPr>
+        <w:t>PriceUpdater</w:t>
+      </w:r>
+      <w:proofErr w:type="spellEnd"/>
+      <w:r>
+        <w:rPr>
+          <w:rFonts w:ascii="Times New Roman" w:eastAsia="Times New Roman" w:hAnsi="Times New Roman" w:cs="Times New Roman"/>
+          <w:sz w:val="24"/>
+          <w:szCs w:val="24"/>
+        </w:rPr>
+        <w:t>/</w:t>
+      </w:r>
+      <w:proofErr w:type="spellStart"/>
+      <w:r>
+        <w:rPr>
+          <w:rFonts w:ascii="Courier New" w:eastAsia="Times New Roman" w:hAnsi="Courier New" w:cs="Courier New"/>
+          <w:sz w:val="20"/>
+          <w:szCs w:val="20"/>
+        </w:rPr>
+        <w:t>OptionPriceUpdater</w:t>
+      </w:r>
+      <w:proofErr w:type="spellEnd"/>
+      <w:r>
+        <w:rPr>
+          <w:rFonts w:ascii="Times New Roman" w:eastAsia="Times New Roman" w:hAnsi="Times New Roman" w:cs="Times New Roman"/>
+          <w:sz w:val="24"/>
+          <w:szCs w:val="24"/>
+        </w:rPr>
+        <w:t xml:space="preserve"> to hand back something more structured (e.g. a small </w:t>
+      </w:r>
+      <w:proofErr w:type="spellStart"/>
+      <w:r>
+        <w:rPr>
+          <w:rFonts w:ascii="Courier New" w:eastAsia="Times New Roman" w:hAnsi="Courier New" w:cs="Courier New"/>
+          <w:sz w:val="20"/>
+          <w:szCs w:val="20"/>
+        </w:rPr>
+        <w:t>FetchBundle</w:t>
+      </w:r>
+      <w:proofErr w:type="spellEnd"/>
+      <w:r>
+        <w:rPr>
+          <w:rFonts w:ascii="Times New Roman" w:eastAsia="Times New Roman" w:hAnsi="Times New Roman" w:cs="Times New Roman"/>
+          <w:sz w:val="24"/>
+          <w:szCs w:val="24"/>
+        </w:rPr>
+        <w:t xml:space="preserve"> </w:t>
+      </w:r>
+      <w:proofErr w:type="spellStart"/>
+      <w:r>
+        <w:rPr>
+          <w:rFonts w:ascii="Times New Roman" w:eastAsia="Times New Roman" w:hAnsi="Times New Roman" w:cs="Times New Roman"/>
+          <w:sz w:val="24"/>
+          <w:szCs w:val="24"/>
+        </w:rPr>
+        <w:t>dataclass</w:t>
+      </w:r>
+      <w:proofErr w:type="spellEnd"/>
+      <w:r>
+        <w:rPr>
+          <w:rFonts w:ascii="Times New Roman" w:eastAsia="Times New Roman" w:hAnsi="Times New Roman" w:cs="Times New Roman"/>
+          <w:sz w:val="24"/>
+          <w:szCs w:val="24"/>
+        </w:rPr>
+        <w:t>) so the call site isn't passing five positional sequences?</w:t>
+      </w:r>
+    </w:p>
+    <w:p>
+      <w:pPr>
+        <w:numPr>
+          <w:ilvl w:val="0"/>
+          <w:numId w:val="5"/>
+        </w:numPr>
+        <w:spacing w:before="100" w:beforeAutospacing="1" w:after="100" w:afterAutospacing="1" w:line="240" w:lineRule="auto"/>
+        <w:rPr>
+          <w:rFonts w:ascii="Times New Roman" w:eastAsia="Times New Roman" w:hAnsi="Times New Roman" w:cs="Times New Roman"/>
+          <w:sz w:val="24"/>
+          <w:szCs w:val="24"/>
+        </w:rPr>
+      </w:pPr>
+      <w:r>
+        <w:rPr>
+          <w:rFonts w:ascii="Times New Roman" w:eastAsia="Times New Roman" w:hAnsi="Times New Roman" w:cs="Times New Roman"/>
+          <w:sz w:val="24"/>
+          <w:szCs w:val="24"/>
+        </w:rPr>
+        <w:t xml:space="preserve">Should </w:t>
+      </w:r>
+      <w:proofErr w:type="spellStart"/>
+      <w:r>
+        <w:rPr>
+          <w:rFonts w:ascii="Courier New" w:eastAsia="Times New Roman" w:hAnsi="Courier New" w:cs="Courier New"/>
+          <w:sz w:val="20"/>
+          <w:szCs w:val="20"/>
+        </w:rPr>
+        <w:t>PriceExporter</w:t>
+      </w:r>
+      <w:proofErr w:type="spellEnd"/>
+      <w:r>
+        <w:rPr>
+          <w:rFonts w:ascii="Times New Roman" w:eastAsia="Times New Roman" w:hAnsi="Times New Roman" w:cs="Times New Roman"/>
+          <w:sz w:val="24"/>
+          <w:szCs w:val="24"/>
+        </w:rPr>
+        <w:t xml:space="preserve"> also own moving completed files from </w:t>
+      </w:r>
+      <w:r>
+        <w:rPr>
+          <w:rFonts w:ascii="Courier New" w:eastAsia="Times New Roman" w:hAnsi="Courier New" w:cs="Courier New"/>
+          <w:sz w:val="20"/>
+          <w:szCs w:val="20"/>
+        </w:rPr>
+        <w:t>pending/</w:t>
+      </w:r>
+      <w:r>
+        <w:rPr>
+          <w:rFonts w:ascii="Times New Roman" w:eastAsia="Times New Roman" w:hAnsi="Times New Roman" w:cs="Times New Roman"/>
+          <w:sz w:val="24"/>
+          <w:szCs w:val="24"/>
+        </w:rPr>
+        <w:t xml:space="preserve"> to </w:t>
+      </w:r>
+      <w:r>
+        <w:rPr>
+          <w:rFonts w:ascii="Courier New" w:eastAsia="Times New Roman" w:hAnsi="Courier New" w:cs="Courier New"/>
+          <w:sz w:val="20"/>
+          <w:szCs w:val="20"/>
+        </w:rPr>
+        <w:t>updated/</w:t>
+      </w:r>
+      <w:r>
+        <w:rPr>
+          <w:rFonts w:ascii="Times New Roman" w:eastAsia="Times New Roman" w:hAnsi="Times New Roman" w:cs="Times New Roman"/>
+          <w:sz w:val="24"/>
+          <w:szCs w:val="24"/>
+        </w:rPr>
+        <w:t xml:space="preserve">, or does that belong entirely to VBA since Python's role ends once the file lands in </w:t>
+      </w:r>
+      <w:r>
+        <w:rPr>
+          <w:rFonts w:ascii="Courier New" w:eastAsia="Times New Roman" w:hAnsi="Courier New" w:cs="Courier New"/>
+          <w:sz w:val="20"/>
+          <w:szCs w:val="20"/>
+        </w:rPr>
+        <w:t>pending/</w:t>
+      </w:r>
+      <w:r>
+        <w:rPr>
+          <w:rFonts w:ascii="Times New Roman" w:eastAsia="Times New Roman" w:hAnsi="Times New Roman" w:cs="Times New Roman"/>
+          <w:sz w:val="24"/>
+          <w:szCs w:val="24"/>
+        </w:rPr>
+        <w:t>?</w:t>
+      </w:r>
+    </w:p>
+    <w:p/>
     <w:p/>
     <w:p/>
     <w:sectPr>
@@ -1125,6 +2476,268 @@
       </w:pPr>
     </w:lvl>
   </w:abstractNum>
+  <w:abstractNum w:abstractNumId="3" w15:restartNumberingAfterBreak="0">
+    <w:nsid w:val="4144176B"/>
+    <w:multiLevelType w:val="multilevel"/>
+    <w:tmpl w:val="0E8686F2"/>
+    <w:lvl w:ilvl="0">
+      <w:start w:val="1"/>
+      <w:numFmt w:val="decimal"/>
+      <w:lvlText w:val="%1."/>
+      <w:lvlJc w:val="left"/>
+      <w:pPr>
+        <w:tabs>
+          <w:tab w:val="num" w:pos="720"/>
+        </w:tabs>
+        <w:ind w:left="720" w:hanging="360"/>
+      </w:pPr>
+    </w:lvl>
+    <w:lvl w:ilvl="1" w:tentative="1">
+      <w:start w:val="1"/>
+      <w:numFmt w:val="decimal"/>
+      <w:lvlText w:val="%2."/>
+      <w:lvlJc w:val="left"/>
+      <w:pPr>
+        <w:tabs>
+          <w:tab w:val="num" w:pos="1440"/>
+        </w:tabs>
+        <w:ind w:left="1440" w:hanging="360"/>
+      </w:pPr>
+    </w:lvl>
+    <w:lvl w:ilvl="2" w:tentative="1">
+      <w:start w:val="1"/>
+      <w:numFmt w:val="decimal"/>
+      <w:lvlText w:val="%3."/>
+      <w:lvlJc w:val="left"/>
+      <w:pPr>
+        <w:tabs>
+          <w:tab w:val="num" w:pos="2160"/>
+        </w:tabs>
+        <w:ind w:left="2160" w:hanging="360"/>
+      </w:pPr>
+    </w:lvl>
+    <w:lvl w:ilvl="3" w:tentative="1">
+      <w:start w:val="1"/>
+      <w:numFmt w:val="decimal"/>
+      <w:lvlText w:val="%4."/>
+      <w:lvlJc w:val="left"/>
+      <w:pPr>
+        <w:tabs>
+          <w:tab w:val="num" w:pos="2880"/>
+        </w:tabs>
+        <w:ind w:left="2880" w:hanging="360"/>
+      </w:pPr>
+    </w:lvl>
+    <w:lvl w:ilvl="4" w:tentative="1">
+      <w:start w:val="1"/>
+      <w:numFmt w:val="decimal"/>
+      <w:lvlText w:val="%5."/>
+      <w:lvlJc w:val="left"/>
+      <w:pPr>
+        <w:tabs>
+          <w:tab w:val="num" w:pos="3600"/>
+        </w:tabs>
+        <w:ind w:left="3600" w:hanging="360"/>
+      </w:pPr>
+    </w:lvl>
+    <w:lvl w:ilvl="5" w:tentative="1">
+      <w:start w:val="1"/>
+      <w:numFmt w:val="decimal"/>
+      <w:lvlText w:val="%6."/>
+      <w:lvlJc w:val="left"/>
+      <w:pPr>
+        <w:tabs>
+          <w:tab w:val="num" w:pos="4320"/>
+        </w:tabs>
+        <w:ind w:left="4320" w:hanging="360"/>
+      </w:pPr>
+    </w:lvl>
+    <w:lvl w:ilvl="6" w:tentative="1">
+      <w:start w:val="1"/>
+      <w:numFmt w:val="decimal"/>
+      <w:lvlText w:val="%7."/>
+      <w:lvlJc w:val="left"/>
+      <w:pPr>
+        <w:tabs>
+          <w:tab w:val="num" w:pos="5040"/>
+        </w:tabs>
+        <w:ind w:left="5040" w:hanging="360"/>
+      </w:pPr>
+    </w:lvl>
+    <w:lvl w:ilvl="7" w:tentative="1">
+      <w:start w:val="1"/>
+      <w:numFmt w:val="decimal"/>
+      <w:lvlText w:val="%8."/>
+      <w:lvlJc w:val="left"/>
+      <w:pPr>
+        <w:tabs>
+          <w:tab w:val="num" w:pos="5760"/>
+        </w:tabs>
+        <w:ind w:left="5760" w:hanging="360"/>
+      </w:pPr>
+    </w:lvl>
+    <w:lvl w:ilvl="8" w:tentative="1">
+      <w:start w:val="1"/>
+      <w:numFmt w:val="decimal"/>
+      <w:lvlText w:val="%9."/>
+      <w:lvlJc w:val="left"/>
+      <w:pPr>
+        <w:tabs>
+          <w:tab w:val="num" w:pos="6480"/>
+        </w:tabs>
+        <w:ind w:left="6480" w:hanging="360"/>
+      </w:pPr>
+    </w:lvl>
+  </w:abstractNum>
+  <w:abstractNum w:abstractNumId="4" w15:restartNumberingAfterBreak="0">
+    <w:nsid w:val="58E0461E"/>
+    <w:multiLevelType w:val="multilevel"/>
+    <w:tmpl w:val="54C2214A"/>
+    <w:lvl w:ilvl="0">
+      <w:start w:val="1"/>
+      <w:numFmt w:val="bullet"/>
+      <w:lvlText w:val=""/>
+      <w:lvlJc w:val="left"/>
+      <w:pPr>
+        <w:tabs>
+          <w:tab w:val="num" w:pos="720"/>
+        </w:tabs>
+        <w:ind w:left="720" w:hanging="360"/>
+      </w:pPr>
+      <w:rPr>
+        <w:rFonts w:ascii="Symbol" w:hAnsi="Symbol" w:hint="default"/>
+        <w:sz w:val="20"/>
+      </w:rPr>
+    </w:lvl>
+    <w:lvl w:ilvl="1" w:tentative="1">
+      <w:start w:val="1"/>
+      <w:numFmt w:val="bullet"/>
+      <w:lvlText w:val="o"/>
+      <w:lvlJc w:val="left"/>
+      <w:pPr>
+        <w:tabs>
+          <w:tab w:val="num" w:pos="1440"/>
+        </w:tabs>
+        <w:ind w:left="1440" w:hanging="360"/>
+      </w:pPr>
+      <w:rPr>
+        <w:rFonts w:ascii="Courier New" w:hAnsi="Courier New" w:hint="default"/>
+        <w:sz w:val="20"/>
+      </w:rPr>
+    </w:lvl>
+    <w:lvl w:ilvl="2" w:tentative="1">
+      <w:start w:val="1"/>
+      <w:numFmt w:val="bullet"/>
+      <w:lvlText w:val=""/>
+      <w:lvlJc w:val="left"/>
+      <w:pPr>
+        <w:tabs>
+          <w:tab w:val="num" w:pos="2160"/>
+        </w:tabs>
+        <w:ind w:left="2160" w:hanging="360"/>
+      </w:pPr>
+      <w:rPr>
+        <w:rFonts w:ascii="Wingdings" w:hAnsi="Wingdings" w:hint="default"/>
+        <w:sz w:val="20"/>
+      </w:rPr>
+    </w:lvl>
+    <w:lvl w:ilvl="3" w:tentative="1">
+      <w:start w:val="1"/>
+      <w:numFmt w:val="bullet"/>
+      <w:lvlText w:val=""/>
+      <w:lvlJc w:val="left"/>
+      <w:pPr>
+        <w:tabs>
+          <w:tab w:val="num" w:pos="2880"/>
+        </w:tabs>
+        <w:ind w:left="2880" w:hanging="360"/>
+      </w:pPr>
+      <w:rPr>
+        <w:rFonts w:ascii="Wingdings" w:hAnsi="Wingdings" w:hint="default"/>
+        <w:sz w:val="20"/>
+      </w:rPr>
+    </w:lvl>
+    <w:lvl w:ilvl="4" w:tentative="1">
+      <w:start w:val="1"/>
+      <w:numFmt w:val="bullet"/>
+      <w:lvlText w:val=""/>
+      <w:lvlJc w:val="left"/>
+      <w:pPr>
+        <w:tabs>
+          <w:tab w:val="num" w:pos="3600"/>
+        </w:tabs>
+        <w:ind w:left="3600" w:hanging="360"/>
+      </w:pPr>
+      <w:rPr>
+        <w:rFonts w:ascii="Wingdings" w:hAnsi="Wingdings" w:hint="default"/>
+        <w:sz w:val="20"/>
+      </w:rPr>
+    </w:lvl>
+    <w:lvl w:ilvl="5" w:tentative="1">
+      <w:start w:val="1"/>
+      <w:numFmt w:val="bullet"/>
+      <w:lvlText w:val=""/>
+      <w:lvlJc w:val="left"/>
+      <w:pPr>
+        <w:tabs>
+          <w:tab w:val="num" w:pos="4320"/>
+        </w:tabs>
+        <w:ind w:left="4320" w:hanging="360"/>
+      </w:pPr>
+      <w:rPr>
+        <w:rFonts w:ascii="Wingdings" w:hAnsi="Wingdings" w:hint="default"/>
+        <w:sz w:val="20"/>
+      </w:rPr>
+    </w:lvl>
+    <w:lvl w:ilvl="6" w:tentative="1">
+      <w:start w:val="1"/>
+      <w:numFmt w:val="bullet"/>
+      <w:lvlText w:val=""/>
+      <w:lvlJc w:val="left"/>
+      <w:pPr>
+        <w:tabs>
+          <w:tab w:val="num" w:pos="5040"/>
+        </w:tabs>
+        <w:ind w:left="5040" w:hanging="360"/>
+      </w:pPr>
+      <w:rPr>
+        <w:rFonts w:ascii="Wingdings" w:hAnsi="Wingdings" w:hint="default"/>
+        <w:sz w:val="20"/>
+      </w:rPr>
+    </w:lvl>
+    <w:lvl w:ilvl="7" w:tentative="1">
+      <w:start w:val="1"/>
+      <w:numFmt w:val="bullet"/>
+      <w:lvlText w:val=""/>
+      <w:lvlJc w:val="left"/>
+      <w:pPr>
+        <w:tabs>
+          <w:tab w:val="num" w:pos="5760"/>
+        </w:tabs>
+        <w:ind w:left="5760" w:hanging="360"/>
+      </w:pPr>
+      <w:rPr>
+        <w:rFonts w:ascii="Wingdings" w:hAnsi="Wingdings" w:hint="default"/>
+        <w:sz w:val="20"/>
+      </w:rPr>
+    </w:lvl>
+    <w:lvl w:ilvl="8" w:tentative="1">
+      <w:start w:val="1"/>
+      <w:numFmt w:val="bullet"/>
+      <w:lvlText w:val=""/>
+      <w:lvlJc w:val="left"/>
+      <w:pPr>
+        <w:tabs>
+          <w:tab w:val="num" w:pos="6480"/>
+        </w:tabs>
+        <w:ind w:left="6480" w:hanging="360"/>
+      </w:pPr>
+      <w:rPr>
+        <w:rFonts w:ascii="Wingdings" w:hAnsi="Wingdings" w:hint="default"/>
+        <w:sz w:val="20"/>
+      </w:rPr>
+    </w:lvl>
+  </w:abstractNum>
   <w:num w:numId="1" w16cid:durableId="1104032180">
     <w:abstractNumId w:val="2"/>
   </w:num>
@@ -1133,6 +2746,12 @@
   </w:num>
   <w:num w:numId="3" w16cid:durableId="1267349110">
     <w:abstractNumId w:val="0"/>
+  </w:num>
+  <w:num w:numId="4" w16cid:durableId="723258780">
+    <w:abstractNumId w:val="4"/>
+  </w:num>
+  <w:num w:numId="5" w16cid:durableId="1223255823">
+    <w:abstractNumId w:val="3"/>
   </w:num>
 </w:numbering>
 </file>
@@ -2167,6 +3786,96 @@
     <w:basedOn w:val="DefaultParagraphFont"/>
     <w:rsid w:val="00772800"/>
   </w:style>
+  <w:style w:type="paragraph" w:styleId="NormalWeb">
+    <w:name w:val="Normal (Web)"/>
+    <w:basedOn w:val="Normal"/>
+    <w:uiPriority w:val="99"/>
+    <w:semiHidden/>
+    <w:unhideWhenUsed/>
+    <w:rsid w:val="00144CF9"/>
+    <w:pPr>
+      <w:spacing w:before="100" w:beforeAutospacing="1" w:after="100" w:afterAutospacing="1" w:line="240" w:lineRule="auto"/>
+    </w:pPr>
+    <w:rPr>
+      <w:rFonts w:ascii="Times New Roman" w:eastAsia="Times New Roman" w:hAnsi="Times New Roman" w:cs="Times New Roman"/>
+      <w:sz w:val="24"/>
+      <w:szCs w:val="24"/>
+    </w:rPr>
+  </w:style>
+  <w:style w:type="character" w:styleId="HTMLCode">
+    <w:name w:val="HTML Code"/>
+    <w:basedOn w:val="DefaultParagraphFont"/>
+    <w:uiPriority w:val="99"/>
+    <w:semiHidden/>
+    <w:unhideWhenUsed/>
+    <w:rsid w:val="00144CF9"/>
+    <w:rPr>
+      <w:rFonts w:ascii="Courier New" w:eastAsia="Times New Roman" w:hAnsi="Courier New" w:cs="Courier New"/>
+      <w:sz w:val="20"/>
+      <w:szCs w:val="20"/>
+    </w:rPr>
+  </w:style>
+  <w:style w:type="paragraph" w:styleId="HTMLPreformatted">
+    <w:name w:val="HTML Preformatted"/>
+    <w:basedOn w:val="Normal"/>
+    <w:link w:val="HTMLPreformattedChar"/>
+    <w:uiPriority w:val="99"/>
+    <w:semiHidden/>
+    <w:unhideWhenUsed/>
+    <w:rsid w:val="00144CF9"/>
+    <w:pPr>
+      <w:tabs>
+        <w:tab w:val="left" w:pos="916"/>
+        <w:tab w:val="left" w:pos="1832"/>
+        <w:tab w:val="left" w:pos="2748"/>
+        <w:tab w:val="left" w:pos="3664"/>
+        <w:tab w:val="left" w:pos="4580"/>
+        <w:tab w:val="left" w:pos="5496"/>
+        <w:tab w:val="left" w:pos="6412"/>
+        <w:tab w:val="left" w:pos="7328"/>
+        <w:tab w:val="left" w:pos="8244"/>
+        <w:tab w:val="left" w:pos="9160"/>
+        <w:tab w:val="left" w:pos="10076"/>
+        <w:tab w:val="left" w:pos="10992"/>
+        <w:tab w:val="left" w:pos="11908"/>
+        <w:tab w:val="left" w:pos="12824"/>
+        <w:tab w:val="left" w:pos="13740"/>
+        <w:tab w:val="left" w:pos="14656"/>
+      </w:tabs>
+      <w:spacing w:after="0" w:line="240" w:lineRule="auto"/>
+    </w:pPr>
+    <w:rPr>
+      <w:rFonts w:ascii="Courier New" w:eastAsia="Times New Roman" w:hAnsi="Courier New" w:cs="Courier New"/>
+      <w:sz w:val="20"/>
+      <w:szCs w:val="20"/>
+    </w:rPr>
+  </w:style>
+  <w:style w:type="character" w:customStyle="1" w:styleId="HTMLPreformattedChar">
+    <w:name w:val="HTML Preformatted Char"/>
+    <w:basedOn w:val="DefaultParagraphFont"/>
+    <w:link w:val="HTMLPreformatted"/>
+    <w:uiPriority w:val="99"/>
+    <w:semiHidden/>
+    <w:rsid w:val="00144CF9"/>
+    <w:rPr>
+      <w:rFonts w:ascii="Courier New" w:eastAsia="Times New Roman" w:hAnsi="Courier New" w:cs="Courier New"/>
+      <w:kern w:val="0"/>
+      <w:sz w:val="20"/>
+      <w:szCs w:val="20"/>
+      <w14:ligatures w14:val="none"/>
+    </w:rPr>
+  </w:style>
+  <w:style w:type="character" w:styleId="Strong">
+    <w:name w:val="Strong"/>
+    <w:basedOn w:val="DefaultParagraphFont"/>
+    <w:uiPriority w:val="22"/>
+    <w:qFormat/>
+    <w:rsid w:val="00144CF9"/>
+    <w:rPr>
+      <w:b/>
+      <w:bCs/>
+    </w:rPr>
+  </w:style>
 </w:styles>
 </file>
 

</xml_diff>